<commit_message>
Example records: partial last bag instead of over-limit bags; star-alias lookup only; generator renders its PDFs
GG1024_01 (870 g) was printed as 2 bags of 435 g, outside 401.0 g +/- 3 %; it is now 2 x 401.0 g
plus one 68.0 g partial bag (T1: 3 669 bags; cartons, pallets, vehicles unchanged). The volume
lookup no longer falls back to the parent batch, only to the recorded star alias (FB012602*).
main() clears pdf/ and now renders the PDFs again. Merged sets and the T1 individual annexes refreshed.

Co-Authored-By: Claude Opus 5.5 <noreply@anthropic.com>
Claude-Session: https://claude.ai/code/session_01Fszd7nMMPhqDmBiyiM2Bec
</commit_message>
<xml_diff>
--- a/deliverables/inland_transport_2026-10/example_T1_T2/docx/T0_CALCULATION.docx
+++ b/deliverables/inland_transport_2026-10/example_T1_T2/docx/T0_CALCULATION.docx
@@ -2001,7 +2001,7 @@
                 <w:color w:val="0B5CAD"/>
                 <w:sz w:val="18"/>
               </w:rPr>
-              <w:t xml:space="preserve">[3668]</w:t>
+              <w:t xml:space="preserve">[3669]</w:t>
             </w:r>
           </w:p>
         </w:tc>
@@ -2587,7 +2587,7 @@
                 <w:color w:val="0B5CAD"/>
                 <w:sz w:val="18"/>
               </w:rPr>
-              <w:t xml:space="preserve">[10345]</w:t>
+              <w:t xml:space="preserve">[10346]</w:t>
             </w:r>
           </w:p>
         </w:tc>
@@ -5025,7 +5025,7 @@
                 <w:color w:val="0B5CAD"/>
                 <w:sz w:val="18"/>
               </w:rPr>
-              <w:t xml:space="preserve">[2]</w:t>
+              <w:t xml:space="preserve">[3]</w:t>
             </w:r>
           </w:p>
         </w:tc>
@@ -5049,7 +5049,7 @@
                 <w:color w:val="0B5CAD"/>
                 <w:sz w:val="18"/>
               </w:rPr>
-              <w:t xml:space="preserve">[435,0]</w:t>
+              <w:t xml:space="preserve">[290,0]</w:t>
             </w:r>
           </w:p>
         </w:tc>
@@ -8125,7 +8125,7 @@
                 <w:color w:val="0B5CAD"/>
                 <w:sz w:val="18"/>
               </w:rPr>
-              <w:t xml:space="preserve">[3668]</w:t>
+              <w:t xml:space="preserve">[3669]</w:t>
             </w:r>
           </w:p>
         </w:tc>

</xml_diff>